<commit_message>
Added names to all pages & Images to attractions page - Anderson 5/21/26
</commit_message>
<xml_diff>
--- a/MODULE-11/Changes to Site.docx
+++ b/MODULE-11/Changes to Site.docx
@@ -20,6 +20,9 @@
     </w:p>
     <w:p>
       <w:r>
+        <w:rPr>
+          <w:noProof/>
+        </w:rPr>
         <w:drawing>
           <wp:inline distT="0" distB="0" distL="0" distR="0" wp14:anchorId="7E89B938" wp14:editId="2BE4DA72">
             <wp:extent cx="4655820" cy="4579218"/>
@@ -68,6 +71,9 @@
     </w:p>
     <w:p>
       <w:r>
+        <w:rPr>
+          <w:noProof/>
+        </w:rPr>
         <w:drawing>
           <wp:inline distT="0" distB="0" distL="0" distR="0" wp14:anchorId="61A73100" wp14:editId="0F43C9C0">
             <wp:extent cx="3322320" cy="3899025"/>
@@ -110,16 +116,24 @@
         <w:pStyle w:val="Heading1"/>
       </w:pPr>
       <w:r>
-        <w:lastRenderedPageBreak/>
         <w:t>Created a Check Out Section for Reservations</w:t>
       </w:r>
     </w:p>
     <w:p>
       <w:r>
+        <w:t>-Anderson (This was Present on the site just wasn’t present in the video)</w:t>
+      </w:r>
+    </w:p>
+    <w:p/>
+    <w:p>
+      <w:r>
+        <w:rPr>
+          <w:noProof/>
+        </w:rPr>
         <w:drawing>
-          <wp:inline distT="0" distB="0" distL="0" distR="0" wp14:anchorId="325AF55E" wp14:editId="3CC8C2D1">
-            <wp:extent cx="3825240" cy="3439446"/>
-            <wp:effectExtent l="0" t="0" r="3810" b="8890"/>
+          <wp:inline distT="0" distB="0" distL="0" distR="0" wp14:anchorId="325AF55E" wp14:editId="1260FCB4">
+            <wp:extent cx="2599389" cy="2337228"/>
+            <wp:effectExtent l="0" t="0" r="0" b="6350"/>
             <wp:docPr id="973350237" name="Picture 1"/>
             <wp:cNvGraphicFramePr>
               <a:graphicFrameLocks xmlns:a="http://schemas.openxmlformats.org/drawingml/2006/main" noChangeAspect="1"/>
@@ -140,7 +154,7 @@
                   <pic:spPr>
                     <a:xfrm>
                       <a:off x="0" y="0"/>
-                      <a:ext cx="3831407" cy="3444991"/>
+                      <a:ext cx="2609193" cy="2346044"/>
                     </a:xfrm>
                     <a:prstGeom prst="rect">
                       <a:avLst/>
@@ -153,8 +167,258 @@
         </w:drawing>
       </w:r>
     </w:p>
+    <w:p>
+      <w:pPr>
+        <w:pStyle w:val="Heading1"/>
+      </w:pPr>
+      <w:r>
+        <w:lastRenderedPageBreak/>
+        <w:t>Adding comments on the registration page code</w:t>
+      </w:r>
+    </w:p>
+    <w:p>
+      <w:r>
+        <w:drawing>
+          <wp:inline distT="0" distB="0" distL="0" distR="0" wp14:anchorId="3699053F" wp14:editId="03B591CC">
+            <wp:extent cx="5943600" cy="4578350"/>
+            <wp:effectExtent l="0" t="0" r="0" b="0"/>
+            <wp:docPr id="870938505" name="Picture 1"/>
+            <wp:cNvGraphicFramePr>
+              <a:graphicFrameLocks xmlns:a="http://schemas.openxmlformats.org/drawingml/2006/main" noChangeAspect="1"/>
+            </wp:cNvGraphicFramePr>
+            <a:graphic xmlns:a="http://schemas.openxmlformats.org/drawingml/2006/main">
+              <a:graphicData uri="http://schemas.openxmlformats.org/drawingml/2006/picture">
+                <pic:pic xmlns:pic="http://schemas.openxmlformats.org/drawingml/2006/picture">
+                  <pic:nvPicPr>
+                    <pic:cNvPr id="870938505" name=""/>
+                    <pic:cNvPicPr/>
+                  </pic:nvPicPr>
+                  <pic:blipFill>
+                    <a:blip r:embed="rId10"/>
+                    <a:stretch>
+                      <a:fillRect/>
+                    </a:stretch>
+                  </pic:blipFill>
+                  <pic:spPr>
+                    <a:xfrm>
+                      <a:off x="0" y="0"/>
+                      <a:ext cx="5943600" cy="4578350"/>
+                    </a:xfrm>
+                    <a:prstGeom prst="rect">
+                      <a:avLst/>
+                    </a:prstGeom>
+                  </pic:spPr>
+                </pic:pic>
+              </a:graphicData>
+            </a:graphic>
+          </wp:inline>
+        </w:drawing>
+      </w:r>
+    </w:p>
+    <w:p>
+      <w:pPr>
+        <w:pStyle w:val="Heading1"/>
+      </w:pPr>
+      <w:r>
+        <w:t>Returned Basic Title to All Pages (Was Removed)</w:t>
+      </w:r>
+    </w:p>
+    <w:p>
+      <w:r>
+        <w:drawing>
+          <wp:inline distT="0" distB="0" distL="0" distR="0" wp14:anchorId="14026105" wp14:editId="0B4A92F2">
+            <wp:extent cx="5943600" cy="2063115"/>
+            <wp:effectExtent l="0" t="0" r="0" b="0"/>
+            <wp:docPr id="1542742516" name="Picture 1"/>
+            <wp:cNvGraphicFramePr>
+              <a:graphicFrameLocks xmlns:a="http://schemas.openxmlformats.org/drawingml/2006/main" noChangeAspect="1"/>
+            </wp:cNvGraphicFramePr>
+            <a:graphic xmlns:a="http://schemas.openxmlformats.org/drawingml/2006/main">
+              <a:graphicData uri="http://schemas.openxmlformats.org/drawingml/2006/picture">
+                <pic:pic xmlns:pic="http://schemas.openxmlformats.org/drawingml/2006/picture">
+                  <pic:nvPicPr>
+                    <pic:cNvPr id="1542742516" name=""/>
+                    <pic:cNvPicPr/>
+                  </pic:nvPicPr>
+                  <pic:blipFill>
+                    <a:blip r:embed="rId11"/>
+                    <a:stretch>
+                      <a:fillRect/>
+                    </a:stretch>
+                  </pic:blipFill>
+                  <pic:spPr>
+                    <a:xfrm>
+                      <a:off x="0" y="0"/>
+                      <a:ext cx="5943600" cy="2063115"/>
+                    </a:xfrm>
+                    <a:prstGeom prst="rect">
+                      <a:avLst/>
+                    </a:prstGeom>
+                  </pic:spPr>
+                </pic:pic>
+              </a:graphicData>
+            </a:graphic>
+          </wp:inline>
+        </w:drawing>
+      </w:r>
+    </w:p>
+    <w:p>
+      <w:pPr>
+        <w:pStyle w:val="Heading1"/>
+      </w:pPr>
+      <w:r>
+        <w:lastRenderedPageBreak/>
+        <w:t>Added names to all pages (was previously “Bravo Team”)</w:t>
+      </w:r>
+    </w:p>
+    <w:p>
+      <w:r>
+        <w:drawing>
+          <wp:inline distT="0" distB="0" distL="0" distR="0" wp14:anchorId="590A3901" wp14:editId="1F685EC0">
+            <wp:extent cx="5943600" cy="511175"/>
+            <wp:effectExtent l="0" t="0" r="0" b="3175"/>
+            <wp:docPr id="1070212153" name="Picture 1"/>
+            <wp:cNvGraphicFramePr>
+              <a:graphicFrameLocks xmlns:a="http://schemas.openxmlformats.org/drawingml/2006/main" noChangeAspect="1"/>
+            </wp:cNvGraphicFramePr>
+            <a:graphic xmlns:a="http://schemas.openxmlformats.org/drawingml/2006/main">
+              <a:graphicData uri="http://schemas.openxmlformats.org/drawingml/2006/picture">
+                <pic:pic xmlns:pic="http://schemas.openxmlformats.org/drawingml/2006/picture">
+                  <pic:nvPicPr>
+                    <pic:cNvPr id="1070212153" name=""/>
+                    <pic:cNvPicPr/>
+                  </pic:nvPicPr>
+                  <pic:blipFill>
+                    <a:blip r:embed="rId12"/>
+                    <a:stretch>
+                      <a:fillRect/>
+                    </a:stretch>
+                  </pic:blipFill>
+                  <pic:spPr>
+                    <a:xfrm>
+                      <a:off x="0" y="0"/>
+                      <a:ext cx="5943600" cy="511175"/>
+                    </a:xfrm>
+                    <a:prstGeom prst="rect">
+                      <a:avLst/>
+                    </a:prstGeom>
+                  </pic:spPr>
+                </pic:pic>
+              </a:graphicData>
+            </a:graphic>
+          </wp:inline>
+        </w:drawing>
+      </w:r>
+    </w:p>
+    <w:p>
+      <w:pPr>
+        <w:pStyle w:val="Heading1"/>
+      </w:pPr>
+      <w:r>
+        <w:t xml:space="preserve">Added </w:t>
+      </w:r>
+      <w:r>
+        <w:t xml:space="preserve">Images to Attractions (View on Hover) Recommended from peer review– Anderson </w:t>
+      </w:r>
+    </w:p>
+    <w:p>
+      <w:r>
+        <w:rPr>
+          <w:noProof/>
+        </w:rPr>
+        <w:drawing>
+          <wp:inline distT="0" distB="0" distL="0" distR="0" wp14:anchorId="22B83EEA" wp14:editId="2CA01110">
+            <wp:extent cx="5943600" cy="1882775"/>
+            <wp:effectExtent l="0" t="0" r="0" b="3175"/>
+            <wp:docPr id="529850170" name="Picture 1"/>
+            <wp:cNvGraphicFramePr>
+              <a:graphicFrameLocks xmlns:a="http://schemas.openxmlformats.org/drawingml/2006/main" noChangeAspect="1"/>
+            </wp:cNvGraphicFramePr>
+            <a:graphic xmlns:a="http://schemas.openxmlformats.org/drawingml/2006/main">
+              <a:graphicData uri="http://schemas.openxmlformats.org/drawingml/2006/picture">
+                <pic:pic xmlns:pic="http://schemas.openxmlformats.org/drawingml/2006/picture">
+                  <pic:nvPicPr>
+                    <pic:cNvPr id="529850170" name="Picture 529850170"/>
+                    <pic:cNvPicPr/>
+                  </pic:nvPicPr>
+                  <pic:blipFill>
+                    <a:blip r:embed="rId13" cstate="print">
+                      <a:extLst>
+                        <a:ext uri="{28A0092B-C50C-407E-A947-70E740481C1C}">
+                          <a14:useLocalDpi xmlns:a14="http://schemas.microsoft.com/office/drawing/2010/main" val="0"/>
+                        </a:ext>
+                      </a:extLst>
+                    </a:blip>
+                    <a:stretch>
+                      <a:fillRect/>
+                    </a:stretch>
+                  </pic:blipFill>
+                  <pic:spPr>
+                    <a:xfrm>
+                      <a:off x="0" y="0"/>
+                      <a:ext cx="5943600" cy="1882775"/>
+                    </a:xfrm>
+                    <a:prstGeom prst="rect">
+                      <a:avLst/>
+                    </a:prstGeom>
+                  </pic:spPr>
+                </pic:pic>
+              </a:graphicData>
+            </a:graphic>
+          </wp:inline>
+        </w:drawing>
+      </w:r>
+      <w:r>
+        <w:rPr>
+          <w:noProof/>
+        </w:rPr>
+        <w:drawing>
+          <wp:inline distT="0" distB="0" distL="0" distR="0" wp14:anchorId="4847BA99" wp14:editId="05159616">
+            <wp:extent cx="5943600" cy="2480310"/>
+            <wp:effectExtent l="0" t="0" r="0" b="0"/>
+            <wp:docPr id="196546771" name="Picture 2"/>
+            <wp:cNvGraphicFramePr>
+              <a:graphicFrameLocks xmlns:a="http://schemas.openxmlformats.org/drawingml/2006/main" noChangeAspect="1"/>
+            </wp:cNvGraphicFramePr>
+            <a:graphic xmlns:a="http://schemas.openxmlformats.org/drawingml/2006/main">
+              <a:graphicData uri="http://schemas.openxmlformats.org/drawingml/2006/picture">
+                <pic:pic xmlns:pic="http://schemas.openxmlformats.org/drawingml/2006/picture">
+                  <pic:nvPicPr>
+                    <pic:cNvPr id="196546771" name="Picture 196546771"/>
+                    <pic:cNvPicPr/>
+                  </pic:nvPicPr>
+                  <pic:blipFill>
+                    <a:blip r:embed="rId14">
+                      <a:extLst>
+                        <a:ext uri="{28A0092B-C50C-407E-A947-70E740481C1C}">
+                          <a14:useLocalDpi xmlns:a14="http://schemas.microsoft.com/office/drawing/2010/main" val="0"/>
+                        </a:ext>
+                      </a:extLst>
+                    </a:blip>
+                    <a:stretch>
+                      <a:fillRect/>
+                    </a:stretch>
+                  </pic:blipFill>
+                  <pic:spPr>
+                    <a:xfrm>
+                      <a:off x="0" y="0"/>
+                      <a:ext cx="5943600" cy="2480310"/>
+                    </a:xfrm>
+                    <a:prstGeom prst="rect">
+                      <a:avLst/>
+                    </a:prstGeom>
+                  </pic:spPr>
+                </pic:pic>
+              </a:graphicData>
+            </a:graphic>
+          </wp:inline>
+        </w:drawing>
+      </w:r>
+    </w:p>
+    <w:p/>
+    <w:p/>
     <w:sectPr>
-      <w:headerReference w:type="default" r:id="rId10"/>
+      <w:headerReference w:type="default" r:id="rId15"/>
       <w:pgSz w:w="12240" w:h="15840"/>
       <w:pgMar w:top="1440" w:right="1440" w:bottom="1440" w:left="1440" w:header="720" w:footer="720" w:gutter="0"/>
       <w:cols w:space="720"/>
@@ -1065,6 +1329,7 @@
   <w:style w:type="character" w:default="1" w:styleId="DefaultParagraphFont">
     <w:name w:val="Default Paragraph Font"/>
     <w:uiPriority w:val="1"/>
+    <w:semiHidden/>
     <w:unhideWhenUsed/>
   </w:style>
   <w:style w:type="table" w:default="1" w:styleId="TableNormal">

</xml_diff>